<commit_message>
Make QA hashes line-ending independent; refresh delivery records
- word_pipeline: exporter code hashed after CRLF->LF normalisation; a checkout
  that only rewrote line endings had marked the layout check stale
- delivery_contract/make_chart: same for chart data and script provenance
- regression tests for both; audit report entry E12
- PDF re-exported from the unchanged DOCX: all 49 pages text-identical and the
  20 reviewed pages render byte-identical to the reviewed version

Co-Authored-By: Claude Opus 5.5 <noreply@anthropic.com>
</commit_message>
<xml_diff>
--- a/examples/ovd-rsi/output/作品书_OpenRSI-Calibrator.docx
+++ b/examples/ovd-rsi/output/作品书_OpenRSI-Calibrator.docx
@@ -108,7 +108,7 @@
         <w:pStyle w:val="1"/>
         <w:jc w:val="center"/>
       </w:pPr>
-      <w:bookmarkStart w:id="0" w:name="_Toc243141659"/>
+      <w:bookmarkStart w:id="0" w:name="_Toc243157134"/>
       <w:r>
         <w:t>摘要</w:t>
       </w:r>
@@ -297,7 +297,7 @@
         <w:pStyle w:val="1"/>
         <w:jc w:val="center"/>
       </w:pPr>
-      <w:bookmarkStart w:id="1" w:name="_Toc243141660"/>
+      <w:bookmarkStart w:id="1" w:name="_Toc243157135"/>
       <w:r>
         <w:t>Abstract</w:t>
       </w:r>
@@ -407,7 +407,7 @@
       <w:r>
         <w:fldChar w:fldCharType="separate"/>
       </w:r>
-      <w:hyperlink w:anchor="_Toc243141659" w:history="1">
+      <w:hyperlink w:anchor="_Toc243157134" w:history="1">
         <w:r>
           <w:rPr>
             <w:rStyle w:val="aff9"/>
@@ -444,7 +444,7 @@
             <w:noProof/>
             <w:webHidden/>
           </w:rPr>
-          <w:instrText>PAGEREF _Toc243141659 \h</w:instrText>
+          <w:instrText>PAGEREF _Toc243157134 \h</w:instrText>
         </w:r>
         <w:r>
           <w:rPr>
@@ -503,7 +503,7 @@
           <w14:ligatures w14:val="standardContextual"/>
         </w:rPr>
       </w:pPr>
-      <w:hyperlink w:anchor="_Toc243141660" w:history="1">
+      <w:hyperlink w:anchor="_Toc243157135" w:history="1">
         <w:r>
           <w:rPr>
             <w:rStyle w:val="aff9"/>
@@ -540,7 +540,7 @@
             <w:noProof/>
             <w:webHidden/>
           </w:rPr>
-          <w:instrText>PAGEREF _Toc243141660 \h</w:instrText>
+          <w:instrText>PAGEREF _Toc243157135 \h</w:instrText>
         </w:r>
         <w:r>
           <w:rPr>
@@ -599,7 +599,7 @@
           <w14:ligatures w14:val="standardContextual"/>
         </w:rPr>
       </w:pPr>
-      <w:hyperlink w:anchor="_Toc243141661" w:history="1">
+      <w:hyperlink w:anchor="_Toc243157136" w:history="1">
         <w:r>
           <w:rPr>
             <w:rStyle w:val="aff9"/>
@@ -664,7 +664,7 @@
             <w:noProof/>
             <w:webHidden/>
           </w:rPr>
-          <w:instrText>PAGEREF _Toc243141661 \h</w:instrText>
+          <w:instrText>PAGEREF _Toc243157136 \h</w:instrText>
         </w:r>
         <w:r>
           <w:rPr>
@@ -724,7 +724,7 @@
           <w14:ligatures w14:val="standardContextual"/>
         </w:rPr>
       </w:pPr>
-      <w:hyperlink w:anchor="_Toc243141662" w:history="1">
+      <w:hyperlink w:anchor="_Toc243157137" w:history="1">
         <w:r>
           <w:rPr>
             <w:rStyle w:val="aff9"/>
@@ -768,7 +768,7 @@
             <w:noProof/>
             <w:webHidden/>
           </w:rPr>
-          <w:instrText>PAGEREF _Toc243141662 \h</w:instrText>
+          <w:instrText>PAGEREF _Toc243157137 \h</w:instrText>
         </w:r>
         <w:r>
           <w:rPr>
@@ -828,7 +828,7 @@
           <w14:ligatures w14:val="standardContextual"/>
         </w:rPr>
       </w:pPr>
-      <w:hyperlink w:anchor="_Toc243141663" w:history="1">
+      <w:hyperlink w:anchor="_Toc243157138" w:history="1">
         <w:r>
           <w:rPr>
             <w:rStyle w:val="aff9"/>
@@ -872,7 +872,7 @@
             <w:noProof/>
             <w:webHidden/>
           </w:rPr>
-          <w:instrText>PAGEREF _Toc243141663 \h</w:instrText>
+          <w:instrText>PAGEREF _Toc243157138 \h</w:instrText>
         </w:r>
         <w:r>
           <w:rPr>
@@ -932,7 +932,7 @@
           <w14:ligatures w14:val="standardContextual"/>
         </w:rPr>
       </w:pPr>
-      <w:hyperlink w:anchor="_Toc243141664" w:history="1">
+      <w:hyperlink w:anchor="_Toc243157139" w:history="1">
         <w:r>
           <w:rPr>
             <w:rStyle w:val="aff9"/>
@@ -976,7 +976,7 @@
             <w:noProof/>
             <w:webHidden/>
           </w:rPr>
-          <w:instrText>PAGEREF _Toc243141664 \h</w:instrText>
+          <w:instrText>PAGEREF _Toc243157139 \h</w:instrText>
         </w:r>
         <w:r>
           <w:rPr>
@@ -1036,7 +1036,7 @@
           <w14:ligatures w14:val="standardContextual"/>
         </w:rPr>
       </w:pPr>
-      <w:hyperlink w:anchor="_Toc243141665" w:history="1">
+      <w:hyperlink w:anchor="_Toc243157140" w:history="1">
         <w:r>
           <w:rPr>
             <w:rStyle w:val="aff9"/>
@@ -1080,7 +1080,7 @@
             <w:noProof/>
             <w:webHidden/>
           </w:rPr>
-          <w:instrText>PAGEREF _Toc243141665 \h</w:instrText>
+          <w:instrText>PAGEREF _Toc243157140 \h</w:instrText>
         </w:r>
         <w:r>
           <w:rPr>
@@ -1140,7 +1140,7 @@
           <w14:ligatures w14:val="standardContextual"/>
         </w:rPr>
       </w:pPr>
-      <w:hyperlink w:anchor="_Toc243141666" w:history="1">
+      <w:hyperlink w:anchor="_Toc243157141" w:history="1">
         <w:r>
           <w:rPr>
             <w:rStyle w:val="aff9"/>
@@ -1184,7 +1184,7 @@
             <w:noProof/>
             <w:webHidden/>
           </w:rPr>
-          <w:instrText>PAGEREF _Toc243141666 \h</w:instrText>
+          <w:instrText>PAGEREF _Toc243157141 \h</w:instrText>
         </w:r>
         <w:r>
           <w:rPr>
@@ -1243,7 +1243,7 @@
           <w14:ligatures w14:val="standardContextual"/>
         </w:rPr>
       </w:pPr>
-      <w:hyperlink w:anchor="_Toc243141667" w:history="1">
+      <w:hyperlink w:anchor="_Toc243157142" w:history="1">
         <w:r>
           <w:rPr>
             <w:rStyle w:val="aff9"/>
@@ -1308,7 +1308,7 @@
             <w:noProof/>
             <w:webHidden/>
           </w:rPr>
-          <w:instrText>PAGEREF _Toc243141667 \h</w:instrText>
+          <w:instrText>PAGEREF _Toc243157142 \h</w:instrText>
         </w:r>
         <w:r>
           <w:rPr>
@@ -1368,7 +1368,7 @@
           <w14:ligatures w14:val="standardContextual"/>
         </w:rPr>
       </w:pPr>
-      <w:hyperlink w:anchor="_Toc243141668" w:history="1">
+      <w:hyperlink w:anchor="_Toc243157143" w:history="1">
         <w:r>
           <w:rPr>
             <w:rStyle w:val="aff9"/>
@@ -1412,7 +1412,7 @@
             <w:noProof/>
             <w:webHidden/>
           </w:rPr>
-          <w:instrText>PAGEREF _Toc243141668 \h</w:instrText>
+          <w:instrText>PAGEREF _Toc243157143 \h</w:instrText>
         </w:r>
         <w:r>
           <w:rPr>
@@ -1472,7 +1472,7 @@
           <w14:ligatures w14:val="standardContextual"/>
         </w:rPr>
       </w:pPr>
-      <w:hyperlink w:anchor="_Toc243141669" w:history="1">
+      <w:hyperlink w:anchor="_Toc243157144" w:history="1">
         <w:r>
           <w:rPr>
             <w:rStyle w:val="aff9"/>
@@ -1516,7 +1516,7 @@
             <w:noProof/>
             <w:webHidden/>
           </w:rPr>
-          <w:instrText>PAGEREF _Toc243141669 \h</w:instrText>
+          <w:instrText>PAGEREF _Toc243157144 \h</w:instrText>
         </w:r>
         <w:r>
           <w:rPr>
@@ -1576,7 +1576,7 @@
           <w14:ligatures w14:val="standardContextual"/>
         </w:rPr>
       </w:pPr>
-      <w:hyperlink w:anchor="_Toc243141670" w:history="1">
+      <w:hyperlink w:anchor="_Toc243157145" w:history="1">
         <w:r>
           <w:rPr>
             <w:rStyle w:val="aff9"/>
@@ -1634,7 +1634,7 @@
             <w:noProof/>
             <w:webHidden/>
           </w:rPr>
-          <w:instrText>PAGEREF _Toc243141670 \h</w:instrText>
+          <w:instrText>PAGEREF _Toc243157145 \h</w:instrText>
         </w:r>
         <w:r>
           <w:rPr>
@@ -1694,7 +1694,7 @@
           <w14:ligatures w14:val="standardContextual"/>
         </w:rPr>
       </w:pPr>
-      <w:hyperlink w:anchor="_Toc243141671" w:history="1">
+      <w:hyperlink w:anchor="_Toc243157146" w:history="1">
         <w:r>
           <w:rPr>
             <w:rStyle w:val="aff9"/>
@@ -1738,7 +1738,7 @@
             <w:noProof/>
             <w:webHidden/>
           </w:rPr>
-          <w:instrText>PAGEREF _Toc243141671 \h</w:instrText>
+          <w:instrText>PAGEREF _Toc243157146 \h</w:instrText>
         </w:r>
         <w:r>
           <w:rPr>
@@ -1798,7 +1798,7 @@
           <w14:ligatures w14:val="standardContextual"/>
         </w:rPr>
       </w:pPr>
-      <w:hyperlink w:anchor="_Toc243141672" w:history="1">
+      <w:hyperlink w:anchor="_Toc243157147" w:history="1">
         <w:r>
           <w:rPr>
             <w:rStyle w:val="aff9"/>
@@ -1842,7 +1842,7 @@
             <w:noProof/>
             <w:webHidden/>
           </w:rPr>
-          <w:instrText>PAGEREF _Toc243141672 \h</w:instrText>
+          <w:instrText>PAGEREF _Toc243157147 \h</w:instrText>
         </w:r>
         <w:r>
           <w:rPr>
@@ -1902,7 +1902,7 @@
           <w14:ligatures w14:val="standardContextual"/>
         </w:rPr>
       </w:pPr>
-      <w:hyperlink w:anchor="_Toc243141673" w:history="1">
+      <w:hyperlink w:anchor="_Toc243157148" w:history="1">
         <w:r>
           <w:rPr>
             <w:rStyle w:val="aff9"/>
@@ -1946,7 +1946,7 @@
             <w:noProof/>
             <w:webHidden/>
           </w:rPr>
-          <w:instrText>PAGEREF _Toc243141673 \h</w:instrText>
+          <w:instrText>PAGEREF _Toc243157148 \h</w:instrText>
         </w:r>
         <w:r>
           <w:rPr>
@@ -2005,7 +2005,7 @@
           <w14:ligatures w14:val="standardContextual"/>
         </w:rPr>
       </w:pPr>
-      <w:hyperlink w:anchor="_Toc243141674" w:history="1">
+      <w:hyperlink w:anchor="_Toc243157149" w:history="1">
         <w:r>
           <w:rPr>
             <w:rStyle w:val="aff9"/>
@@ -2070,7 +2070,7 @@
             <w:noProof/>
             <w:webHidden/>
           </w:rPr>
-          <w:instrText>PAGEREF _Toc243141674 \h</w:instrText>
+          <w:instrText>PAGEREF _Toc243157149 \h</w:instrText>
         </w:r>
         <w:r>
           <w:rPr>
@@ -2130,7 +2130,7 @@
           <w14:ligatures w14:val="standardContextual"/>
         </w:rPr>
       </w:pPr>
-      <w:hyperlink w:anchor="_Toc243141675" w:history="1">
+      <w:hyperlink w:anchor="_Toc243157150" w:history="1">
         <w:r>
           <w:rPr>
             <w:rStyle w:val="aff9"/>
@@ -2174,7 +2174,7 @@
             <w:noProof/>
             <w:webHidden/>
           </w:rPr>
-          <w:instrText>PAGEREF _Toc243141675 \h</w:instrText>
+          <w:instrText>PAGEREF _Toc243157150 \h</w:instrText>
         </w:r>
         <w:r>
           <w:rPr>
@@ -2234,7 +2234,7 @@
           <w14:ligatures w14:val="standardContextual"/>
         </w:rPr>
       </w:pPr>
-      <w:hyperlink w:anchor="_Toc243141676" w:history="1">
+      <w:hyperlink w:anchor="_Toc243157151" w:history="1">
         <w:r>
           <w:rPr>
             <w:rStyle w:val="aff9"/>
@@ -2278,7 +2278,7 @@
             <w:noProof/>
             <w:webHidden/>
           </w:rPr>
-          <w:instrText>PAGEREF _Toc243141676 \h</w:instrText>
+          <w:instrText>PAGEREF _Toc243157151 \h</w:instrText>
         </w:r>
         <w:r>
           <w:rPr>
@@ -2338,7 +2338,7 @@
           <w14:ligatures w14:val="standardContextual"/>
         </w:rPr>
       </w:pPr>
-      <w:hyperlink w:anchor="_Toc243141677" w:history="1">
+      <w:hyperlink w:anchor="_Toc243157152" w:history="1">
         <w:r>
           <w:rPr>
             <w:rStyle w:val="aff9"/>
@@ -2382,7 +2382,7 @@
             <w:noProof/>
             <w:webHidden/>
           </w:rPr>
-          <w:instrText>PAGEREF _Toc243141677 \h</w:instrText>
+          <w:instrText>PAGEREF _Toc243157152 \h</w:instrText>
         </w:r>
         <w:r>
           <w:rPr>
@@ -2442,7 +2442,7 @@
           <w14:ligatures w14:val="standardContextual"/>
         </w:rPr>
       </w:pPr>
-      <w:hyperlink w:anchor="_Toc243141678" w:history="1">
+      <w:hyperlink w:anchor="_Toc243157153" w:history="1">
         <w:r>
           <w:rPr>
             <w:rStyle w:val="aff9"/>
@@ -2486,7 +2486,7 @@
             <w:noProof/>
             <w:webHidden/>
           </w:rPr>
-          <w:instrText>PAGEREF _Toc243141678 \h</w:instrText>
+          <w:instrText>PAGEREF _Toc243157153 \h</w:instrText>
         </w:r>
         <w:r>
           <w:rPr>
@@ -2545,7 +2545,7 @@
           <w14:ligatures w14:val="standardContextual"/>
         </w:rPr>
       </w:pPr>
-      <w:hyperlink w:anchor="_Toc243141679" w:history="1">
+      <w:hyperlink w:anchor="_Toc243157154" w:history="1">
         <w:r>
           <w:rPr>
             <w:rStyle w:val="aff9"/>
@@ -2610,7 +2610,7 @@
             <w:noProof/>
             <w:webHidden/>
           </w:rPr>
-          <w:instrText>PAGEREF _Toc243141679 \h</w:instrText>
+          <w:instrText>PAGEREF _Toc243157154 \h</w:instrText>
         </w:r>
         <w:r>
           <w:rPr>
@@ -2670,7 +2670,7 @@
           <w14:ligatures w14:val="standardContextual"/>
         </w:rPr>
       </w:pPr>
-      <w:hyperlink w:anchor="_Toc243141680" w:history="1">
+      <w:hyperlink w:anchor="_Toc243157155" w:history="1">
         <w:r>
           <w:rPr>
             <w:rStyle w:val="aff9"/>
@@ -2714,7 +2714,7 @@
             <w:noProof/>
             <w:webHidden/>
           </w:rPr>
-          <w:instrText>PAGEREF _Toc243141680 \h</w:instrText>
+          <w:instrText>PAGEREF _Toc243157155 \h</w:instrText>
         </w:r>
         <w:r>
           <w:rPr>
@@ -2774,7 +2774,7 @@
           <w14:ligatures w14:val="standardContextual"/>
         </w:rPr>
       </w:pPr>
-      <w:hyperlink w:anchor="_Toc243141681" w:history="1">
+      <w:hyperlink w:anchor="_Toc243157156" w:history="1">
         <w:r>
           <w:rPr>
             <w:rStyle w:val="aff9"/>
@@ -2818,7 +2818,7 @@
             <w:noProof/>
             <w:webHidden/>
           </w:rPr>
-          <w:instrText>PAGEREF _Toc243141681 \h</w:instrText>
+          <w:instrText>PAGEREF _Toc243157156 \h</w:instrText>
         </w:r>
         <w:r>
           <w:rPr>
@@ -2878,7 +2878,7 @@
           <w14:ligatures w14:val="standardContextual"/>
         </w:rPr>
       </w:pPr>
-      <w:hyperlink w:anchor="_Toc243141682" w:history="1">
+      <w:hyperlink w:anchor="_Toc243157157" w:history="1">
         <w:r>
           <w:rPr>
             <w:rStyle w:val="aff9"/>
@@ -2922,7 +2922,7 @@
             <w:noProof/>
             <w:webHidden/>
           </w:rPr>
-          <w:instrText>PAGEREF _Toc243141682 \h</w:instrText>
+          <w:instrText>PAGEREF _Toc243157157 \h</w:instrText>
         </w:r>
         <w:r>
           <w:rPr>
@@ -2982,7 +2982,7 @@
           <w14:ligatures w14:val="standardContextual"/>
         </w:rPr>
       </w:pPr>
-      <w:hyperlink w:anchor="_Toc243141683" w:history="1">
+      <w:hyperlink w:anchor="_Toc243157158" w:history="1">
         <w:r>
           <w:rPr>
             <w:rStyle w:val="aff9"/>
@@ -3026,7 +3026,7 @@
             <w:noProof/>
             <w:webHidden/>
           </w:rPr>
-          <w:instrText>PAGEREF _Toc243141683 \h</w:instrText>
+          <w:instrText>PAGEREF _Toc243157158 \h</w:instrText>
         </w:r>
         <w:r>
           <w:rPr>
@@ -3086,7 +3086,7 @@
           <w14:ligatures w14:val="standardContextual"/>
         </w:rPr>
       </w:pPr>
-      <w:hyperlink w:anchor="_Toc243141684" w:history="1">
+      <w:hyperlink w:anchor="_Toc243157159" w:history="1">
         <w:r>
           <w:rPr>
             <w:rStyle w:val="aff9"/>
@@ -3130,7 +3130,7 @@
             <w:noProof/>
             <w:webHidden/>
           </w:rPr>
-          <w:instrText>PAGEREF _Toc243141684 \h</w:instrText>
+          <w:instrText>PAGEREF _Toc243157159 \h</w:instrText>
         </w:r>
         <w:r>
           <w:rPr>
@@ -3190,7 +3190,7 @@
           <w14:ligatures w14:val="standardContextual"/>
         </w:rPr>
       </w:pPr>
-      <w:hyperlink w:anchor="_Toc243141685" w:history="1">
+      <w:hyperlink w:anchor="_Toc243157160" w:history="1">
         <w:r>
           <w:rPr>
             <w:rStyle w:val="aff9"/>
@@ -3234,7 +3234,7 @@
             <w:noProof/>
             <w:webHidden/>
           </w:rPr>
-          <w:instrText>PAGEREF _Toc243141685 \h</w:instrText>
+          <w:instrText>PAGEREF _Toc243157160 \h</w:instrText>
         </w:r>
         <w:r>
           <w:rPr>
@@ -3294,7 +3294,7 @@
           <w14:ligatures w14:val="standardContextual"/>
         </w:rPr>
       </w:pPr>
-      <w:hyperlink w:anchor="_Toc243141686" w:history="1">
+      <w:hyperlink w:anchor="_Toc243157161" w:history="1">
         <w:r>
           <w:rPr>
             <w:rStyle w:val="aff9"/>
@@ -3338,7 +3338,7 @@
             <w:noProof/>
             <w:webHidden/>
           </w:rPr>
-          <w:instrText>PAGEREF _Toc243141686 \h</w:instrText>
+          <w:instrText>PAGEREF _Toc243157161 \h</w:instrText>
         </w:r>
         <w:r>
           <w:rPr>
@@ -3398,7 +3398,7 @@
           <w14:ligatures w14:val="standardContextual"/>
         </w:rPr>
       </w:pPr>
-      <w:hyperlink w:anchor="_Toc243141687" w:history="1">
+      <w:hyperlink w:anchor="_Toc243157162" w:history="1">
         <w:r>
           <w:rPr>
             <w:rStyle w:val="aff9"/>
@@ -3442,7 +3442,7 @@
             <w:noProof/>
             <w:webHidden/>
           </w:rPr>
-          <w:instrText>PAGEREF _Toc243141687 \h</w:instrText>
+          <w:instrText>PAGEREF _Toc243157162 \h</w:instrText>
         </w:r>
         <w:r>
           <w:rPr>
@@ -3502,7 +3502,7 @@
           <w14:ligatures w14:val="standardContextual"/>
         </w:rPr>
       </w:pPr>
-      <w:hyperlink w:anchor="_Toc243141688" w:history="1">
+      <w:hyperlink w:anchor="_Toc243157163" w:history="1">
         <w:r>
           <w:rPr>
             <w:rStyle w:val="aff9"/>
@@ -3546,7 +3546,7 @@
             <w:noProof/>
             <w:webHidden/>
           </w:rPr>
-          <w:instrText>PAGEREF _Toc243141688 \h</w:instrText>
+          <w:instrText>PAGEREF _Toc243157163 \h</w:instrText>
         </w:r>
         <w:r>
           <w:rPr>
@@ -3606,7 +3606,7 @@
           <w14:ligatures w14:val="standardContextual"/>
         </w:rPr>
       </w:pPr>
-      <w:hyperlink w:anchor="_Toc243141689" w:history="1">
+      <w:hyperlink w:anchor="_Toc243157164" w:history="1">
         <w:r>
           <w:rPr>
             <w:rStyle w:val="aff9"/>
@@ -3650,7 +3650,7 @@
             <w:noProof/>
             <w:webHidden/>
           </w:rPr>
-          <w:instrText>PAGEREF _Toc243141689 \h</w:instrText>
+          <w:instrText>PAGEREF _Toc243157164 \h</w:instrText>
         </w:r>
         <w:r>
           <w:rPr>
@@ -3710,7 +3710,7 @@
           <w14:ligatures w14:val="standardContextual"/>
         </w:rPr>
       </w:pPr>
-      <w:hyperlink w:anchor="_Toc243141690" w:history="1">
+      <w:hyperlink w:anchor="_Toc243157165" w:history="1">
         <w:r>
           <w:rPr>
             <w:rStyle w:val="aff9"/>
@@ -3754,7 +3754,7 @@
             <w:noProof/>
             <w:webHidden/>
           </w:rPr>
-          <w:instrText>PAGEREF _Toc243141690 \h</w:instrText>
+          <w:instrText>PAGEREF _Toc243157165 \h</w:instrText>
         </w:r>
         <w:r>
           <w:rPr>
@@ -3814,7 +3814,7 @@
           <w14:ligatures w14:val="standardContextual"/>
         </w:rPr>
       </w:pPr>
-      <w:hyperlink w:anchor="_Toc243141691" w:history="1">
+      <w:hyperlink w:anchor="_Toc243157166" w:history="1">
         <w:r>
           <w:rPr>
             <w:rStyle w:val="aff9"/>
@@ -3858,7 +3858,7 @@
             <w:noProof/>
             <w:webHidden/>
           </w:rPr>
-          <w:instrText>PAGEREF _Toc243141691 \h</w:instrText>
+          <w:instrText>PAGEREF _Toc243157166 \h</w:instrText>
         </w:r>
         <w:r>
           <w:rPr>
@@ -3918,7 +3918,7 @@
           <w14:ligatures w14:val="standardContextual"/>
         </w:rPr>
       </w:pPr>
-      <w:hyperlink w:anchor="_Toc243141692" w:history="1">
+      <w:hyperlink w:anchor="_Toc243157167" w:history="1">
         <w:r>
           <w:rPr>
             <w:rStyle w:val="aff9"/>
@@ -3962,7 +3962,7 @@
             <w:noProof/>
             <w:webHidden/>
           </w:rPr>
-          <w:instrText>PAGEREF _Toc243141692 \h</w:instrText>
+          <w:instrText>PAGEREF _Toc243157167 \h</w:instrText>
         </w:r>
         <w:r>
           <w:rPr>
@@ -4022,7 +4022,7 @@
           <w14:ligatures w14:val="standardContextual"/>
         </w:rPr>
       </w:pPr>
-      <w:hyperlink w:anchor="_Toc243141693" w:history="1">
+      <w:hyperlink w:anchor="_Toc243157168" w:history="1">
         <w:r>
           <w:rPr>
             <w:rStyle w:val="aff9"/>
@@ -4066,7 +4066,7 @@
             <w:noProof/>
             <w:webHidden/>
           </w:rPr>
-          <w:instrText>PAGEREF _Toc243141693 \h</w:instrText>
+          <w:instrText>PAGEREF _Toc243157168 \h</w:instrText>
         </w:r>
         <w:r>
           <w:rPr>
@@ -4126,7 +4126,7 @@
           <w14:ligatures w14:val="standardContextual"/>
         </w:rPr>
       </w:pPr>
-      <w:hyperlink w:anchor="_Toc243141694" w:history="1">
+      <w:hyperlink w:anchor="_Toc243157169" w:history="1">
         <w:r>
           <w:rPr>
             <w:rStyle w:val="aff9"/>
@@ -4170,7 +4170,7 @@
             <w:noProof/>
             <w:webHidden/>
           </w:rPr>
-          <w:instrText>PAGEREF _Toc243141694 \h</w:instrText>
+          <w:instrText>PAGEREF _Toc243157169 \h</w:instrText>
         </w:r>
         <w:r>
           <w:rPr>
@@ -4230,7 +4230,7 @@
           <w14:ligatures w14:val="standardContextual"/>
         </w:rPr>
       </w:pPr>
-      <w:hyperlink w:anchor="_Toc243141695" w:history="1">
+      <w:hyperlink w:anchor="_Toc243157170" w:history="1">
         <w:r>
           <w:rPr>
             <w:rStyle w:val="aff9"/>
@@ -4274,7 +4274,7 @@
             <w:noProof/>
             <w:webHidden/>
           </w:rPr>
-          <w:instrText>PAGEREF _Toc243141695 \h</w:instrText>
+          <w:instrText>PAGEREF _Toc243157170 \h</w:instrText>
         </w:r>
         <w:r>
           <w:rPr>
@@ -4333,7 +4333,7 @@
           <w14:ligatures w14:val="standardContextual"/>
         </w:rPr>
       </w:pPr>
-      <w:hyperlink w:anchor="_Toc243141696" w:history="1">
+      <w:hyperlink w:anchor="_Toc243157171" w:history="1">
         <w:r>
           <w:rPr>
             <w:rStyle w:val="aff9"/>
@@ -4398,7 +4398,7 @@
             <w:noProof/>
             <w:webHidden/>
           </w:rPr>
-          <w:instrText>PAGEREF _Toc243141696 \h</w:instrText>
+          <w:instrText>PAGEREF _Toc243157171 \h</w:instrText>
         </w:r>
         <w:r>
           <w:rPr>
@@ -4458,7 +4458,7 @@
           <w14:ligatures w14:val="standardContextual"/>
         </w:rPr>
       </w:pPr>
-      <w:hyperlink w:anchor="_Toc243141697" w:history="1">
+      <w:hyperlink w:anchor="_Toc243157172" w:history="1">
         <w:r>
           <w:rPr>
             <w:rStyle w:val="aff9"/>
@@ -4502,7 +4502,7 @@
             <w:noProof/>
             <w:webHidden/>
           </w:rPr>
-          <w:instrText>PAGEREF _Toc243141697 \h</w:instrText>
+          <w:instrText>PAGEREF _Toc243157172 \h</w:instrText>
         </w:r>
         <w:r>
           <w:rPr>
@@ -4562,7 +4562,7 @@
           <w14:ligatures w14:val="standardContextual"/>
         </w:rPr>
       </w:pPr>
-      <w:hyperlink w:anchor="_Toc243141698" w:history="1">
+      <w:hyperlink w:anchor="_Toc243157173" w:history="1">
         <w:r>
           <w:rPr>
             <w:rStyle w:val="aff9"/>
@@ -4606,7 +4606,7 @@
             <w:noProof/>
             <w:webHidden/>
           </w:rPr>
-          <w:instrText>PAGEREF _Toc243141698 \h</w:instrText>
+          <w:instrText>PAGEREF _Toc243157173 \h</w:instrText>
         </w:r>
         <w:r>
           <w:rPr>
@@ -4666,7 +4666,7 @@
           <w14:ligatures w14:val="standardContextual"/>
         </w:rPr>
       </w:pPr>
-      <w:hyperlink w:anchor="_Toc243141699" w:history="1">
+      <w:hyperlink w:anchor="_Toc243157174" w:history="1">
         <w:r>
           <w:rPr>
             <w:rStyle w:val="aff9"/>
@@ -4710,7 +4710,7 @@
             <w:noProof/>
             <w:webHidden/>
           </w:rPr>
-          <w:instrText>PAGEREF _Toc243141699 \h</w:instrText>
+          <w:instrText>PAGEREF _Toc243157174 \h</w:instrText>
         </w:r>
         <w:r>
           <w:rPr>
@@ -4770,7 +4770,7 @@
           <w14:ligatures w14:val="standardContextual"/>
         </w:rPr>
       </w:pPr>
-      <w:hyperlink w:anchor="_Toc243141700" w:history="1">
+      <w:hyperlink w:anchor="_Toc243157175" w:history="1">
         <w:r>
           <w:rPr>
             <w:rStyle w:val="aff9"/>
@@ -4814,7 +4814,7 @@
             <w:noProof/>
             <w:webHidden/>
           </w:rPr>
-          <w:instrText>PAGEREF _Toc243141700 \h</w:instrText>
+          <w:instrText>PAGEREF _Toc243157175 \h</w:instrText>
         </w:r>
         <w:r>
           <w:rPr>
@@ -4874,7 +4874,7 @@
           <w14:ligatures w14:val="standardContextual"/>
         </w:rPr>
       </w:pPr>
-      <w:hyperlink w:anchor="_Toc243141701" w:history="1">
+      <w:hyperlink w:anchor="_Toc243157176" w:history="1">
         <w:r>
           <w:rPr>
             <w:rStyle w:val="aff9"/>
@@ -4918,7 +4918,7 @@
             <w:noProof/>
             <w:webHidden/>
           </w:rPr>
-          <w:instrText>PAGEREF _Toc243141701 \h</w:instrText>
+          <w:instrText>PAGEREF _Toc243157176 \h</w:instrText>
         </w:r>
         <w:r>
           <w:rPr>
@@ -4978,7 +4978,7 @@
           <w14:ligatures w14:val="standardContextual"/>
         </w:rPr>
       </w:pPr>
-      <w:hyperlink w:anchor="_Toc243141702" w:history="1">
+      <w:hyperlink w:anchor="_Toc243157177" w:history="1">
         <w:r>
           <w:rPr>
             <w:rStyle w:val="aff9"/>
@@ -5022,7 +5022,7 @@
             <w:noProof/>
             <w:webHidden/>
           </w:rPr>
-          <w:instrText>PAGEREF _Toc243141702 \h</w:instrText>
+          <w:instrText>PAGEREF _Toc243157177 \h</w:instrText>
         </w:r>
         <w:r>
           <w:rPr>
@@ -5082,7 +5082,7 @@
           <w14:ligatures w14:val="standardContextual"/>
         </w:rPr>
       </w:pPr>
-      <w:hyperlink w:anchor="_Toc243141703" w:history="1">
+      <w:hyperlink w:anchor="_Toc243157178" w:history="1">
         <w:r>
           <w:rPr>
             <w:rStyle w:val="aff9"/>
@@ -5126,7 +5126,7 @@
             <w:noProof/>
             <w:webHidden/>
           </w:rPr>
-          <w:instrText>PAGEREF _Toc243141703 \h</w:instrText>
+          <w:instrText>PAGEREF _Toc243157178 \h</w:instrText>
         </w:r>
         <w:r>
           <w:rPr>
@@ -5186,7 +5186,7 @@
           <w14:ligatures w14:val="standardContextual"/>
         </w:rPr>
       </w:pPr>
-      <w:hyperlink w:anchor="_Toc243141704" w:history="1">
+      <w:hyperlink w:anchor="_Toc243157179" w:history="1">
         <w:r>
           <w:rPr>
             <w:rStyle w:val="aff9"/>
@@ -5230,7 +5230,7 @@
             <w:noProof/>
             <w:webHidden/>
           </w:rPr>
-          <w:instrText>PAGEREF _Toc243141704 \h</w:instrText>
+          <w:instrText>PAGEREF _Toc243157179 \h</w:instrText>
         </w:r>
         <w:r>
           <w:rPr>
@@ -5290,7 +5290,7 @@
           <w14:ligatures w14:val="standardContextual"/>
         </w:rPr>
       </w:pPr>
-      <w:hyperlink w:anchor="_Toc243141705" w:history="1">
+      <w:hyperlink w:anchor="_Toc243157180" w:history="1">
         <w:r>
           <w:rPr>
             <w:rStyle w:val="aff9"/>
@@ -5334,7 +5334,7 @@
             <w:noProof/>
             <w:webHidden/>
           </w:rPr>
-          <w:instrText>PAGEREF _Toc243141705 \h</w:instrText>
+          <w:instrText>PAGEREF _Toc243157180 \h</w:instrText>
         </w:r>
         <w:r>
           <w:rPr>
@@ -5394,7 +5394,7 @@
           <w14:ligatures w14:val="standardContextual"/>
         </w:rPr>
       </w:pPr>
-      <w:hyperlink w:anchor="_Toc243141706" w:history="1">
+      <w:hyperlink w:anchor="_Toc243157181" w:history="1">
         <w:r>
           <w:rPr>
             <w:rStyle w:val="aff9"/>
@@ -5438,7 +5438,7 @@
             <w:noProof/>
             <w:webHidden/>
           </w:rPr>
-          <w:instrText>PAGEREF _Toc243141706 \h</w:instrText>
+          <w:instrText>PAGEREF _Toc243157181 \h</w:instrText>
         </w:r>
         <w:r>
           <w:rPr>
@@ -5498,7 +5498,7 @@
           <w14:ligatures w14:val="standardContextual"/>
         </w:rPr>
       </w:pPr>
-      <w:hyperlink w:anchor="_Toc243141707" w:history="1">
+      <w:hyperlink w:anchor="_Toc243157182" w:history="1">
         <w:r>
           <w:rPr>
             <w:rStyle w:val="aff9"/>
@@ -5542,7 +5542,7 @@
             <w:noProof/>
             <w:webHidden/>
           </w:rPr>
-          <w:instrText>PAGEREF _Toc243141707 \h</w:instrText>
+          <w:instrText>PAGEREF _Toc243157182 \h</w:instrText>
         </w:r>
         <w:r>
           <w:rPr>
@@ -5602,7 +5602,7 @@
           <w14:ligatures w14:val="standardContextual"/>
         </w:rPr>
       </w:pPr>
-      <w:hyperlink w:anchor="_Toc243141708" w:history="1">
+      <w:hyperlink w:anchor="_Toc243157183" w:history="1">
         <w:r>
           <w:rPr>
             <w:rStyle w:val="aff9"/>
@@ -5646,7 +5646,7 @@
             <w:noProof/>
             <w:webHidden/>
           </w:rPr>
-          <w:instrText>PAGEREF _Toc243141708 \h</w:instrText>
+          <w:instrText>PAGEREF _Toc243157183 \h</w:instrText>
         </w:r>
         <w:r>
           <w:rPr>
@@ -5705,7 +5705,7 @@
           <w14:ligatures w14:val="standardContextual"/>
         </w:rPr>
       </w:pPr>
-      <w:hyperlink w:anchor="_Toc243141709" w:history="1">
+      <w:hyperlink w:anchor="_Toc243157184" w:history="1">
         <w:r>
           <w:rPr>
             <w:rStyle w:val="aff9"/>
@@ -5770,7 +5770,7 @@
             <w:noProof/>
             <w:webHidden/>
           </w:rPr>
-          <w:instrText>PAGEREF _Toc243141709 \h</w:instrText>
+          <w:instrText>PAGEREF _Toc243157184 \h</w:instrText>
         </w:r>
         <w:r>
           <w:rPr>
@@ -5830,7 +5830,7 @@
           <w14:ligatures w14:val="standardContextual"/>
         </w:rPr>
       </w:pPr>
-      <w:hyperlink w:anchor="_Toc243141710" w:history="1">
+      <w:hyperlink w:anchor="_Toc243157185" w:history="1">
         <w:r>
           <w:rPr>
             <w:rStyle w:val="aff9"/>
@@ -5874,7 +5874,7 @@
             <w:noProof/>
             <w:webHidden/>
           </w:rPr>
-          <w:instrText>PAGEREF _Toc243141710 \h</w:instrText>
+          <w:instrText>PAGEREF _Toc243157185 \h</w:instrText>
         </w:r>
         <w:r>
           <w:rPr>
@@ -5934,7 +5934,7 @@
           <w14:ligatures w14:val="standardContextual"/>
         </w:rPr>
       </w:pPr>
-      <w:hyperlink w:anchor="_Toc243141711" w:history="1">
+      <w:hyperlink w:anchor="_Toc243157186" w:history="1">
         <w:r>
           <w:rPr>
             <w:rStyle w:val="aff9"/>
@@ -5978,7 +5978,7 @@
             <w:noProof/>
             <w:webHidden/>
           </w:rPr>
-          <w:instrText>PAGEREF _Toc243141711 \h</w:instrText>
+          <w:instrText>PAGEREF _Toc243157186 \h</w:instrText>
         </w:r>
         <w:r>
           <w:rPr>
@@ -6038,7 +6038,7 @@
           <w14:ligatures w14:val="standardContextual"/>
         </w:rPr>
       </w:pPr>
-      <w:hyperlink w:anchor="_Toc243141712" w:history="1">
+      <w:hyperlink w:anchor="_Toc243157187" w:history="1">
         <w:r>
           <w:rPr>
             <w:rStyle w:val="aff9"/>
@@ -6082,7 +6082,7 @@
             <w:noProof/>
             <w:webHidden/>
           </w:rPr>
-          <w:instrText>PAGEREF _Toc243141712 \h</w:instrText>
+          <w:instrText>PAGEREF _Toc243157187 \h</w:instrText>
         </w:r>
         <w:r>
           <w:rPr>
@@ -6142,7 +6142,7 @@
           <w14:ligatures w14:val="standardContextual"/>
         </w:rPr>
       </w:pPr>
-      <w:hyperlink w:anchor="_Toc243141713" w:history="1">
+      <w:hyperlink w:anchor="_Toc243157188" w:history="1">
         <w:r>
           <w:rPr>
             <w:rStyle w:val="aff9"/>
@@ -6186,7 +6186,7 @@
             <w:noProof/>
             <w:webHidden/>
           </w:rPr>
-          <w:instrText>PAGEREF _Toc243141713 \h</w:instrText>
+          <w:instrText>PAGEREF _Toc243157188 \h</w:instrText>
         </w:r>
         <w:r>
           <w:rPr>
@@ -6246,7 +6246,7 @@
           <w14:ligatures w14:val="standardContextual"/>
         </w:rPr>
       </w:pPr>
-      <w:hyperlink w:anchor="_Toc243141714" w:history="1">
+      <w:hyperlink w:anchor="_Toc243157189" w:history="1">
         <w:r>
           <w:rPr>
             <w:rStyle w:val="aff9"/>
@@ -6290,7 +6290,7 @@
             <w:noProof/>
             <w:webHidden/>
           </w:rPr>
-          <w:instrText>PAGEREF _Toc243141714 \h</w:instrText>
+          <w:instrText>PAGEREF _Toc243157189 \h</w:instrText>
         </w:r>
         <w:r>
           <w:rPr>
@@ -6349,7 +6349,7 @@
           <w14:ligatures w14:val="standardContextual"/>
         </w:rPr>
       </w:pPr>
-      <w:hyperlink w:anchor="_Toc243141715" w:history="1">
+      <w:hyperlink w:anchor="_Toc243157190" w:history="1">
         <w:r>
           <w:rPr>
             <w:rStyle w:val="aff9"/>
@@ -6414,7 +6414,7 @@
             <w:noProof/>
             <w:webHidden/>
           </w:rPr>
-          <w:instrText>PAGEREF _Toc243141715 \h</w:instrText>
+          <w:instrText>PAGEREF _Toc243157190 \h</w:instrText>
         </w:r>
         <w:r>
           <w:rPr>
@@ -6474,7 +6474,7 @@
           <w14:ligatures w14:val="standardContextual"/>
         </w:rPr>
       </w:pPr>
-      <w:hyperlink w:anchor="_Toc243141716" w:history="1">
+      <w:hyperlink w:anchor="_Toc243157191" w:history="1">
         <w:r>
           <w:rPr>
             <w:rStyle w:val="aff9"/>
@@ -6518,7 +6518,7 @@
             <w:noProof/>
             <w:webHidden/>
           </w:rPr>
-          <w:instrText>PAGEREF _Toc243141716 \h</w:instrText>
+          <w:instrText>PAGEREF _Toc243157191 \h</w:instrText>
         </w:r>
         <w:r>
           <w:rPr>
@@ -6578,7 +6578,7 @@
           <w14:ligatures w14:val="standardContextual"/>
         </w:rPr>
       </w:pPr>
-      <w:hyperlink w:anchor="_Toc243141717" w:history="1">
+      <w:hyperlink w:anchor="_Toc243157192" w:history="1">
         <w:r>
           <w:rPr>
             <w:rStyle w:val="aff9"/>
@@ -6622,7 +6622,7 @@
             <w:noProof/>
             <w:webHidden/>
           </w:rPr>
-          <w:instrText>PAGEREF _Toc243141717 \h</w:instrText>
+          <w:instrText>PAGEREF _Toc243157192 \h</w:instrText>
         </w:r>
         <w:r>
           <w:rPr>
@@ -6682,7 +6682,7 @@
           <w14:ligatures w14:val="standardContextual"/>
         </w:rPr>
       </w:pPr>
-      <w:hyperlink w:anchor="_Toc243141718" w:history="1">
+      <w:hyperlink w:anchor="_Toc243157193" w:history="1">
         <w:r>
           <w:rPr>
             <w:rStyle w:val="aff9"/>
@@ -6726,7 +6726,7 @@
             <w:noProof/>
             <w:webHidden/>
           </w:rPr>
-          <w:instrText>PAGEREF _Toc243141718 \h</w:instrText>
+          <w:instrText>PAGEREF _Toc243157193 \h</w:instrText>
         </w:r>
         <w:r>
           <w:rPr>
@@ -6785,7 +6785,7 @@
           <w14:ligatures w14:val="standardContextual"/>
         </w:rPr>
       </w:pPr>
-      <w:hyperlink w:anchor="_Toc243141719" w:history="1">
+      <w:hyperlink w:anchor="_Toc243157194" w:history="1">
         <w:r>
           <w:rPr>
             <w:rStyle w:val="aff9"/>
@@ -6822,7 +6822,7 @@
             <w:noProof/>
             <w:webHidden/>
           </w:rPr>
-          <w:instrText>PAGEREF _Toc243141719 \h</w:instrText>
+          <w:instrText>PAGEREF _Toc243157194 \h</w:instrText>
         </w:r>
         <w:r>
           <w:rPr>
@@ -6887,7 +6887,7 @@
         <w:pStyle w:val="1"/>
         <w:jc w:val="center"/>
       </w:pPr>
-      <w:bookmarkStart w:id="2" w:name="_Toc243141661"/>
+      <w:bookmarkStart w:id="2" w:name="_Toc243157136"/>
       <w:r>
         <w:t>第</w:t>
       </w:r>
@@ -6909,7 +6909,7 @@
       <w:pPr>
         <w:pStyle w:val="21"/>
       </w:pPr>
-      <w:bookmarkStart w:id="3" w:name="_Toc243141662"/>
+      <w:bookmarkStart w:id="3" w:name="_Toc243157137"/>
       <w:r>
         <w:t xml:space="preserve">1.1 </w:t>
       </w:r>
@@ -7236,7 +7236,7 @@
       <w:pPr>
         <w:pStyle w:val="21"/>
       </w:pPr>
-      <w:bookmarkStart w:id="4" w:name="_Toc243141663"/>
+      <w:bookmarkStart w:id="4" w:name="_Toc243157138"/>
       <w:r>
         <w:t xml:space="preserve">1.2 </w:t>
       </w:r>
@@ -7321,7 +7321,7 @@
       <w:pPr>
         <w:pStyle w:val="21"/>
       </w:pPr>
-      <w:bookmarkStart w:id="5" w:name="_Toc243141664"/>
+      <w:bookmarkStart w:id="5" w:name="_Toc243157139"/>
       <w:r>
         <w:t xml:space="preserve">1.3 </w:t>
       </w:r>
@@ -8278,7 +8278,7 @@
       <w:pPr>
         <w:pStyle w:val="21"/>
       </w:pPr>
-      <w:bookmarkStart w:id="6" w:name="_Toc243141665"/>
+      <w:bookmarkStart w:id="6" w:name="_Toc243157140"/>
       <w:r>
         <w:t xml:space="preserve">1.4 </w:t>
       </w:r>
@@ -8381,7 +8381,7 @@
           <w:noProof/>
         </w:rPr>
         <w:drawing>
-          <wp:inline distT="0" distB="0" distL="0" distR="0" wp14:anchorId="7ECBCE21" wp14:editId="6BAFC005">
+          <wp:inline distT="0" distB="0" distL="0" distR="0" wp14:anchorId="5F53B84B" wp14:editId="29D1EF9C">
             <wp:extent cx="5040000" cy="2835572"/>
             <wp:effectExtent l="0" t="0" r="0" b="0"/>
             <wp:docPr id="1" name="Picture 1"/>
@@ -8472,7 +8472,7 @@
       <w:pPr>
         <w:pStyle w:val="21"/>
       </w:pPr>
-      <w:bookmarkStart w:id="7" w:name="_Toc243141666"/>
+      <w:bookmarkStart w:id="7" w:name="_Toc243157141"/>
       <w:r>
         <w:t xml:space="preserve">1.5 </w:t>
       </w:r>
@@ -8553,7 +8553,7 @@
         <w:pStyle w:val="1"/>
         <w:jc w:val="center"/>
       </w:pPr>
-      <w:bookmarkStart w:id="8" w:name="_Toc243141667"/>
+      <w:bookmarkStart w:id="8" w:name="_Toc243157142"/>
       <w:r>
         <w:t>第</w:t>
       </w:r>
@@ -8640,7 +8640,7 @@
       <w:pPr>
         <w:pStyle w:val="21"/>
       </w:pPr>
-      <w:bookmarkStart w:id="9" w:name="_Toc243141668"/>
+      <w:bookmarkStart w:id="9" w:name="_Toc243157143"/>
       <w:r>
         <w:t xml:space="preserve">2.1 </w:t>
       </w:r>
@@ -9808,7 +9808,7 @@
           <w:noProof/>
         </w:rPr>
         <w:drawing>
-          <wp:inline distT="0" distB="0" distL="0" distR="0" wp14:anchorId="50667FB8" wp14:editId="073E9216">
+          <wp:inline distT="0" distB="0" distL="0" distR="0" wp14:anchorId="75E20FC1" wp14:editId="7C836861">
             <wp:extent cx="5040000" cy="2591652"/>
             <wp:effectExtent l="0" t="0" r="0" b="0"/>
             <wp:docPr id="2" name="Picture 2"/>
@@ -9959,7 +9959,7 @@
       <w:pPr>
         <w:pStyle w:val="21"/>
       </w:pPr>
-      <w:bookmarkStart w:id="10" w:name="_Toc243141669"/>
+      <w:bookmarkStart w:id="10" w:name="_Toc243157144"/>
       <w:r>
         <w:t xml:space="preserve">2.2 </w:t>
       </w:r>
@@ -11166,7 +11166,7 @@
       <w:pPr>
         <w:pStyle w:val="21"/>
       </w:pPr>
-      <w:bookmarkStart w:id="11" w:name="_Toc243141670"/>
+      <w:bookmarkStart w:id="11" w:name="_Toc243157145"/>
       <w:r>
         <w:t xml:space="preserve">2.3 </w:t>
       </w:r>
@@ -11312,7 +11312,7 @@
       <w:pPr>
         <w:pStyle w:val="21"/>
       </w:pPr>
-      <w:bookmarkStart w:id="12" w:name="_Toc243141671"/>
+      <w:bookmarkStart w:id="12" w:name="_Toc243157146"/>
       <w:r>
         <w:t xml:space="preserve">2.4 </w:t>
       </w:r>
@@ -12886,7 +12886,7 @@
       <w:pPr>
         <w:pStyle w:val="21"/>
       </w:pPr>
-      <w:bookmarkStart w:id="13" w:name="_Toc243141672"/>
+      <w:bookmarkStart w:id="13" w:name="_Toc243157147"/>
       <w:r>
         <w:t xml:space="preserve">2.5 </w:t>
       </w:r>
@@ -13108,7 +13108,7 @@
       <w:pPr>
         <w:pStyle w:val="21"/>
       </w:pPr>
-      <w:bookmarkStart w:id="14" w:name="_Toc243141673"/>
+      <w:bookmarkStart w:id="14" w:name="_Toc243157148"/>
       <w:r>
         <w:t xml:space="preserve">2.6 </w:t>
       </w:r>
@@ -13306,7 +13306,7 @@
         <w:pStyle w:val="1"/>
         <w:jc w:val="center"/>
       </w:pPr>
-      <w:bookmarkStart w:id="15" w:name="_Toc243141674"/>
+      <w:bookmarkStart w:id="15" w:name="_Toc243157149"/>
       <w:r>
         <w:t>第</w:t>
       </w:r>
@@ -13369,7 +13369,7 @@
       <w:pPr>
         <w:pStyle w:val="21"/>
       </w:pPr>
-      <w:bookmarkStart w:id="16" w:name="_Toc243141675"/>
+      <w:bookmarkStart w:id="16" w:name="_Toc243157150"/>
       <w:r>
         <w:t xml:space="preserve">3.1 </w:t>
       </w:r>
@@ -14148,7 +14148,7 @@
       <w:pPr>
         <w:pStyle w:val="21"/>
       </w:pPr>
-      <w:bookmarkStart w:id="17" w:name="_Toc243141676"/>
+      <w:bookmarkStart w:id="17" w:name="_Toc243157151"/>
       <w:r>
         <w:t xml:space="preserve">3.2 </w:t>
       </w:r>
@@ -15222,7 +15222,7 @@
       <w:pPr>
         <w:pStyle w:val="21"/>
       </w:pPr>
-      <w:bookmarkStart w:id="18" w:name="_Toc243141677"/>
+      <w:bookmarkStart w:id="18" w:name="_Toc243157152"/>
       <w:r>
         <w:t xml:space="preserve">3.3 </w:t>
       </w:r>
@@ -16514,7 +16514,7 @@
       <w:pPr>
         <w:pStyle w:val="21"/>
       </w:pPr>
-      <w:bookmarkStart w:id="19" w:name="_Toc243141678"/>
+      <w:bookmarkStart w:id="19" w:name="_Toc243157153"/>
       <w:r>
         <w:t xml:space="preserve">3.4 </w:t>
       </w:r>
@@ -16594,7 +16594,7 @@
         <w:pStyle w:val="1"/>
         <w:jc w:val="center"/>
       </w:pPr>
-      <w:bookmarkStart w:id="20" w:name="_Toc243141679"/>
+      <w:bookmarkStart w:id="20" w:name="_Toc243157154"/>
       <w:r>
         <w:t>第</w:t>
       </w:r>
@@ -16616,7 +16616,7 @@
       <w:pPr>
         <w:pStyle w:val="21"/>
       </w:pPr>
-      <w:bookmarkStart w:id="21" w:name="_Toc243141680"/>
+      <w:bookmarkStart w:id="21" w:name="_Toc243157155"/>
       <w:r>
         <w:t xml:space="preserve">4.1 </w:t>
       </w:r>
@@ -16669,7 +16669,7 @@
           <w:noProof/>
         </w:rPr>
         <w:drawing>
-          <wp:inline distT="0" distB="0" distL="0" distR="0" wp14:anchorId="0676FA1D" wp14:editId="1D65CCC8">
+          <wp:inline distT="0" distB="0" distL="0" distR="0" wp14:anchorId="58484873" wp14:editId="68103D51">
             <wp:extent cx="5040000" cy="2835572"/>
             <wp:effectExtent l="0" t="0" r="0" b="0"/>
             <wp:docPr id="3" name="Picture 3"/>
@@ -16838,7 +16838,7 @@
       <w:pPr>
         <w:pStyle w:val="21"/>
       </w:pPr>
-      <w:bookmarkStart w:id="22" w:name="_Toc243141681"/>
+      <w:bookmarkStart w:id="22" w:name="_Toc243157156"/>
       <w:r>
         <w:t xml:space="preserve">4.2 </w:t>
       </w:r>
@@ -16851,7 +16851,7 @@
       <w:pPr>
         <w:pStyle w:val="31"/>
       </w:pPr>
-      <w:bookmarkStart w:id="23" w:name="_Toc243141682"/>
+      <w:bookmarkStart w:id="23" w:name="_Toc243157157"/>
       <w:r>
         <w:t xml:space="preserve">4.2.1 </w:t>
       </w:r>
@@ -17120,7 +17120,7 @@
       <w:pPr>
         <w:pStyle w:val="31"/>
       </w:pPr>
-      <w:bookmarkStart w:id="24" w:name="_Toc243141683"/>
+      <w:bookmarkStart w:id="24" w:name="_Toc243157158"/>
       <w:r>
         <w:t xml:space="preserve">4.2.2 </w:t>
       </w:r>
@@ -17232,7 +17232,7 @@
           <w:noProof/>
         </w:rPr>
         <w:drawing>
-          <wp:inline distT="0" distB="0" distL="0" distR="0" wp14:anchorId="656DC881" wp14:editId="3FB1F161">
+          <wp:inline distT="0" distB="0" distL="0" distR="0" wp14:anchorId="520D2896" wp14:editId="5DDAEC5D">
             <wp:extent cx="5040000" cy="2835572"/>
             <wp:effectExtent l="0" t="0" r="0" b="0"/>
             <wp:docPr id="4" name="Picture 4"/>
@@ -17688,7 +17688,7 @@
       <w:pPr>
         <w:pStyle w:val="31"/>
       </w:pPr>
-      <w:bookmarkStart w:id="25" w:name="_Toc243141684"/>
+      <w:bookmarkStart w:id="25" w:name="_Toc243157159"/>
       <w:r>
         <w:t xml:space="preserve">4.2.3 </w:t>
       </w:r>
@@ -17935,7 +17935,7 @@
       <w:pPr>
         <w:pStyle w:val="31"/>
       </w:pPr>
-      <w:bookmarkStart w:id="26" w:name="_Toc243141685"/>
+      <w:bookmarkStart w:id="26" w:name="_Toc243157160"/>
       <w:r>
         <w:t xml:space="preserve">4.2.4 </w:t>
       </w:r>
@@ -17997,7 +17997,7 @@
       <w:pPr>
         <w:pStyle w:val="21"/>
       </w:pPr>
-      <w:bookmarkStart w:id="27" w:name="_Toc243141686"/>
+      <w:bookmarkStart w:id="27" w:name="_Toc243157161"/>
       <w:r>
         <w:t xml:space="preserve">4.3 </w:t>
       </w:r>
@@ -18010,7 +18010,7 @@
       <w:pPr>
         <w:pStyle w:val="31"/>
       </w:pPr>
-      <w:bookmarkStart w:id="28" w:name="_Toc243141687"/>
+      <w:bookmarkStart w:id="28" w:name="_Toc243157162"/>
       <w:r>
         <w:t xml:space="preserve">4.3.1 </w:t>
       </w:r>
@@ -18159,7 +18159,7 @@
           <w:noProof/>
         </w:rPr>
         <w:drawing>
-          <wp:inline distT="0" distB="0" distL="0" distR="0" wp14:anchorId="2885DB06" wp14:editId="32304547">
+          <wp:inline distT="0" distB="0" distL="0" distR="0" wp14:anchorId="32AA9EE0" wp14:editId="569DD137">
             <wp:extent cx="5040000" cy="2832523"/>
             <wp:effectExtent l="0" t="0" r="0" b="0"/>
             <wp:docPr id="5" name="Picture 5"/>
@@ -18216,7 +18216,7 @@
       <w:pPr>
         <w:pStyle w:val="31"/>
       </w:pPr>
-      <w:bookmarkStart w:id="29" w:name="_Toc243141688"/>
+      <w:bookmarkStart w:id="29" w:name="_Toc243157163"/>
       <w:r>
         <w:t xml:space="preserve">4.3.2 </w:t>
       </w:r>
@@ -18742,7 +18742,7 @@
       <w:pPr>
         <w:pStyle w:val="21"/>
       </w:pPr>
-      <w:bookmarkStart w:id="30" w:name="_Toc243141689"/>
+      <w:bookmarkStart w:id="30" w:name="_Toc243157164"/>
       <w:r>
         <w:t xml:space="preserve">4.4 </w:t>
       </w:r>
@@ -18854,7 +18854,7 @@
       <w:pPr>
         <w:pStyle w:val="21"/>
       </w:pPr>
-      <w:bookmarkStart w:id="31" w:name="_Toc243141690"/>
+      <w:bookmarkStart w:id="31" w:name="_Toc243157165"/>
       <w:r>
         <w:t xml:space="preserve">4.5 </w:t>
       </w:r>
@@ -18867,7 +18867,7 @@
       <w:pPr>
         <w:pStyle w:val="31"/>
       </w:pPr>
-      <w:bookmarkStart w:id="32" w:name="_Toc243141691"/>
+      <w:bookmarkStart w:id="32" w:name="_Toc243157166"/>
       <w:r>
         <w:t xml:space="preserve">4.5.1 </w:t>
       </w:r>
@@ -19141,7 +19141,7 @@
       <w:pPr>
         <w:pStyle w:val="31"/>
       </w:pPr>
-      <w:bookmarkStart w:id="33" w:name="_Toc243141692"/>
+      <w:bookmarkStart w:id="33" w:name="_Toc243157167"/>
       <w:r>
         <w:t xml:space="preserve">4.5.2 </w:t>
       </w:r>
@@ -19368,7 +19368,7 @@
       <w:pPr>
         <w:pStyle w:val="31"/>
       </w:pPr>
-      <w:bookmarkStart w:id="34" w:name="_Toc243141693"/>
+      <w:bookmarkStart w:id="34" w:name="_Toc243157168"/>
       <w:r>
         <w:t xml:space="preserve">4.5.3 </w:t>
       </w:r>
@@ -20388,7 +20388,7 @@
       <w:pPr>
         <w:pStyle w:val="31"/>
       </w:pPr>
-      <w:bookmarkStart w:id="35" w:name="_Toc243141694"/>
+      <w:bookmarkStart w:id="35" w:name="_Toc243157169"/>
       <w:r>
         <w:t xml:space="preserve">4.5.4 </w:t>
       </w:r>
@@ -20436,7 +20436,7 @@
       <w:pPr>
         <w:pStyle w:val="21"/>
       </w:pPr>
-      <w:bookmarkStart w:id="36" w:name="_Toc243141695"/>
+      <w:bookmarkStart w:id="36" w:name="_Toc243157170"/>
       <w:r>
         <w:t xml:space="preserve">4.6 </w:t>
       </w:r>
@@ -21709,7 +21709,7 @@
         <w:pStyle w:val="1"/>
         <w:jc w:val="center"/>
       </w:pPr>
-      <w:bookmarkStart w:id="37" w:name="_Toc243141696"/>
+      <w:bookmarkStart w:id="37" w:name="_Toc243157171"/>
       <w:r>
         <w:t>第</w:t>
       </w:r>
@@ -21760,7 +21760,7 @@
       <w:pPr>
         <w:pStyle w:val="21"/>
       </w:pPr>
-      <w:bookmarkStart w:id="38" w:name="_Toc243141697"/>
+      <w:bookmarkStart w:id="38" w:name="_Toc243157172"/>
       <w:r>
         <w:t xml:space="preserve">5.1 </w:t>
       </w:r>
@@ -23151,7 +23151,7 @@
       <w:pPr>
         <w:pStyle w:val="21"/>
       </w:pPr>
-      <w:bookmarkStart w:id="39" w:name="_Toc243141698"/>
+      <w:bookmarkStart w:id="39" w:name="_Toc243157173"/>
       <w:r>
         <w:t xml:space="preserve">5.2 </w:t>
       </w:r>
@@ -23164,7 +23164,7 @@
       <w:pPr>
         <w:pStyle w:val="31"/>
       </w:pPr>
-      <w:bookmarkStart w:id="40" w:name="_Toc243141699"/>
+      <w:bookmarkStart w:id="40" w:name="_Toc243157174"/>
       <w:r>
         <w:t xml:space="preserve">5.2.1 </w:t>
       </w:r>
@@ -23991,7 +23991,7 @@
       <w:pPr>
         <w:pStyle w:val="31"/>
       </w:pPr>
-      <w:bookmarkStart w:id="41" w:name="_Toc243141700"/>
+      <w:bookmarkStart w:id="41" w:name="_Toc243157175"/>
       <w:r>
         <w:t xml:space="preserve">5.2.2 </w:t>
       </w:r>
@@ -24170,7 +24170,7 @@
       <w:pPr>
         <w:pStyle w:val="21"/>
       </w:pPr>
-      <w:bookmarkStart w:id="42" w:name="_Toc243141701"/>
+      <w:bookmarkStart w:id="42" w:name="_Toc243157176"/>
       <w:r>
         <w:t xml:space="preserve">5.3 </w:t>
       </w:r>
@@ -24914,7 +24914,7 @@
       <w:pPr>
         <w:pStyle w:val="21"/>
       </w:pPr>
-      <w:bookmarkStart w:id="43" w:name="_Toc243141702"/>
+      <w:bookmarkStart w:id="43" w:name="_Toc243157177"/>
       <w:r>
         <w:t xml:space="preserve">5.4 </w:t>
       </w:r>
@@ -26782,7 +26782,7 @@
       <w:pPr>
         <w:pStyle w:val="21"/>
       </w:pPr>
-      <w:bookmarkStart w:id="44" w:name="_Toc243141703"/>
+      <w:bookmarkStart w:id="44" w:name="_Toc243157178"/>
       <w:r>
         <w:t xml:space="preserve">5.5 </w:t>
       </w:r>
@@ -29631,7 +29631,7 @@
       <w:pPr>
         <w:pStyle w:val="21"/>
       </w:pPr>
-      <w:bookmarkStart w:id="45" w:name="_Toc243141704"/>
+      <w:bookmarkStart w:id="45" w:name="_Toc243157179"/>
       <w:r>
         <w:t xml:space="preserve">5.6 </w:t>
       </w:r>
@@ -30615,7 +30615,7 @@
       <w:pPr>
         <w:pStyle w:val="21"/>
       </w:pPr>
-      <w:bookmarkStart w:id="46" w:name="_Toc243141705"/>
+      <w:bookmarkStart w:id="46" w:name="_Toc243157180"/>
       <w:r>
         <w:t xml:space="preserve">5.7 </w:t>
       </w:r>
@@ -31711,7 +31711,7 @@
       <w:pPr>
         <w:pStyle w:val="21"/>
       </w:pPr>
-      <w:bookmarkStart w:id="47" w:name="_Toc243141706"/>
+      <w:bookmarkStart w:id="47" w:name="_Toc243157181"/>
       <w:r>
         <w:t xml:space="preserve">5.8 </w:t>
       </w:r>
@@ -32122,7 +32122,7 @@
       <w:pPr>
         <w:pStyle w:val="21"/>
       </w:pPr>
-      <w:bookmarkStart w:id="48" w:name="_Toc243141707"/>
+      <w:bookmarkStart w:id="48" w:name="_Toc243157182"/>
       <w:r>
         <w:t xml:space="preserve">5.9 </w:t>
       </w:r>
@@ -32295,7 +32295,7 @@
           <w:noProof/>
         </w:rPr>
         <w:drawing>
-          <wp:inline distT="0" distB="0" distL="0" distR="0" wp14:anchorId="00DE954E" wp14:editId="76128303">
+          <wp:inline distT="0" distB="0" distL="0" distR="0" wp14:anchorId="7F6FFCA6" wp14:editId="063C6C10">
             <wp:extent cx="5040000" cy="2835572"/>
             <wp:effectExtent l="0" t="0" r="0" b="0"/>
             <wp:docPr id="6" name="Picture 6"/>
@@ -32352,7 +32352,7 @@
       <w:pPr>
         <w:pStyle w:val="21"/>
       </w:pPr>
-      <w:bookmarkStart w:id="49" w:name="_Toc243141708"/>
+      <w:bookmarkStart w:id="49" w:name="_Toc243157183"/>
       <w:r>
         <w:t xml:space="preserve">5.10 </w:t>
       </w:r>
@@ -33652,7 +33652,7 @@
         <w:pStyle w:val="1"/>
         <w:jc w:val="center"/>
       </w:pPr>
-      <w:bookmarkStart w:id="50" w:name="_Toc243141709"/>
+      <w:bookmarkStart w:id="50" w:name="_Toc243157184"/>
       <w:r>
         <w:t>第</w:t>
       </w:r>
@@ -33674,7 +33674,7 @@
       <w:pPr>
         <w:pStyle w:val="21"/>
       </w:pPr>
-      <w:bookmarkStart w:id="51" w:name="_Toc243141710"/>
+      <w:bookmarkStart w:id="51" w:name="_Toc243157185"/>
       <w:r>
         <w:t xml:space="preserve">6.1 </w:t>
       </w:r>
@@ -33809,7 +33809,7 @@
       <w:pPr>
         <w:pStyle w:val="21"/>
       </w:pPr>
-      <w:bookmarkStart w:id="52" w:name="_Toc243141711"/>
+      <w:bookmarkStart w:id="52" w:name="_Toc243157186"/>
       <w:r>
         <w:t xml:space="preserve">6.2 </w:t>
       </w:r>
@@ -34892,7 +34892,7 @@
       <w:pPr>
         <w:pStyle w:val="21"/>
       </w:pPr>
-      <w:bookmarkStart w:id="53" w:name="_Toc243141712"/>
+      <w:bookmarkStart w:id="53" w:name="_Toc243157187"/>
       <w:r>
         <w:t xml:space="preserve">6.3 </w:t>
       </w:r>
@@ -35506,7 +35506,7 @@
       <w:pPr>
         <w:pStyle w:val="21"/>
       </w:pPr>
-      <w:bookmarkStart w:id="54" w:name="_Toc243141713"/>
+      <w:bookmarkStart w:id="54" w:name="_Toc243157188"/>
       <w:r>
         <w:t xml:space="preserve">6.4 </w:t>
       </w:r>
@@ -35588,7 +35588,7 @@
       <w:pPr>
         <w:pStyle w:val="21"/>
       </w:pPr>
-      <w:bookmarkStart w:id="55" w:name="_Toc243141714"/>
+      <w:bookmarkStart w:id="55" w:name="_Toc243157189"/>
       <w:r>
         <w:t xml:space="preserve">6.5 </w:t>
       </w:r>
@@ -35656,7 +35656,7 @@
         <w:pStyle w:val="1"/>
         <w:jc w:val="center"/>
       </w:pPr>
-      <w:bookmarkStart w:id="56" w:name="_Toc243141715"/>
+      <w:bookmarkStart w:id="56" w:name="_Toc243157190"/>
       <w:r>
         <w:t>第</w:t>
       </w:r>
@@ -35678,7 +35678,7 @@
       <w:pPr>
         <w:pStyle w:val="21"/>
       </w:pPr>
-      <w:bookmarkStart w:id="57" w:name="_Toc243141716"/>
+      <w:bookmarkStart w:id="57" w:name="_Toc243157191"/>
       <w:r>
         <w:t xml:space="preserve">7.1 </w:t>
       </w:r>
@@ -35795,7 +35795,7 @@
       <w:pPr>
         <w:pStyle w:val="21"/>
       </w:pPr>
-      <w:bookmarkStart w:id="58" w:name="_Toc243141717"/>
+      <w:bookmarkStart w:id="58" w:name="_Toc243157192"/>
       <w:r>
         <w:t xml:space="preserve">7.2 </w:t>
       </w:r>
@@ -35867,7 +35867,7 @@
       <w:pPr>
         <w:pStyle w:val="21"/>
       </w:pPr>
-      <w:bookmarkStart w:id="59" w:name="_Toc243141718"/>
+      <w:bookmarkStart w:id="59" w:name="_Toc243157193"/>
       <w:r>
         <w:t xml:space="preserve">7.3 </w:t>
       </w:r>
@@ -35906,7 +35906,7 @@
         <w:pStyle w:val="1"/>
         <w:jc w:val="center"/>
       </w:pPr>
-      <w:bookmarkStart w:id="60" w:name="_Toc243141719"/>
+      <w:bookmarkStart w:id="60" w:name="_Toc243157194"/>
       <w:r>
         <w:t>参考文献</w:t>
       </w:r>
@@ -36567,31 +36567,31 @@
       </w:rPr>
     </w:lvl>
   </w:abstractNum>
-  <w:num w:numId="1" w16cid:durableId="618797327">
+  <w:num w:numId="1" w16cid:durableId="1680425397">
     <w:abstractNumId w:val="8"/>
   </w:num>
-  <w:num w:numId="2" w16cid:durableId="568536794">
+  <w:num w:numId="2" w16cid:durableId="938559097">
     <w:abstractNumId w:val="6"/>
   </w:num>
-  <w:num w:numId="3" w16cid:durableId="879703636">
+  <w:num w:numId="3" w16cid:durableId="415131272">
     <w:abstractNumId w:val="5"/>
   </w:num>
-  <w:num w:numId="4" w16cid:durableId="304742743">
+  <w:num w:numId="4" w16cid:durableId="925311446">
     <w:abstractNumId w:val="4"/>
   </w:num>
-  <w:num w:numId="5" w16cid:durableId="1080829509">
+  <w:num w:numId="5" w16cid:durableId="1777870945">
     <w:abstractNumId w:val="7"/>
   </w:num>
-  <w:num w:numId="6" w16cid:durableId="1361316857">
+  <w:num w:numId="6" w16cid:durableId="213080225">
     <w:abstractNumId w:val="3"/>
   </w:num>
-  <w:num w:numId="7" w16cid:durableId="850724339">
+  <w:num w:numId="7" w16cid:durableId="104230394">
     <w:abstractNumId w:val="2"/>
   </w:num>
-  <w:num w:numId="8" w16cid:durableId="1097091907">
+  <w:num w:numId="8" w16cid:durableId="1182207692">
     <w:abstractNumId w:val="1"/>
   </w:num>
-  <w:num w:numId="9" w16cid:durableId="232474572">
+  <w:num w:numId="9" w16cid:durableId="2070373949">
     <w:abstractNumId w:val="0"/>
   </w:num>
 </w:numbering>
@@ -47955,7 +47955,7 @@
     <w:autoRedefine/>
     <w:uiPriority w:val="39"/>
     <w:unhideWhenUsed/>
-    <w:rsid w:val="000318E2"/>
+    <w:rsid w:val="003A39AE"/>
   </w:style>
   <w:style w:type="paragraph" w:styleId="TOC2">
     <w:name w:val="toc 2"/>
@@ -47964,7 +47964,7 @@
     <w:autoRedefine/>
     <w:uiPriority w:val="39"/>
     <w:unhideWhenUsed/>
-    <w:rsid w:val="000318E2"/>
+    <w:rsid w:val="003A39AE"/>
     <w:pPr>
       <w:ind w:leftChars="200" w:left="420"/>
     </w:pPr>
@@ -47976,7 +47976,7 @@
     <w:autoRedefine/>
     <w:uiPriority w:val="39"/>
     <w:unhideWhenUsed/>
-    <w:rsid w:val="000318E2"/>
+    <w:rsid w:val="003A39AE"/>
     <w:pPr>
       <w:ind w:leftChars="400" w:left="840"/>
     </w:pPr>
@@ -47986,7 +47986,7 @@
     <w:basedOn w:val="a2"/>
     <w:uiPriority w:val="99"/>
     <w:unhideWhenUsed/>
-    <w:rsid w:val="000318E2"/>
+    <w:rsid w:val="003A39AE"/>
     <w:rPr>
       <w:color w:val="0000FF" w:themeColor="hyperlink"/>
       <w:u w:val="single"/>

</xml_diff>